<commit_message>
Explicita na fala do slide 14 a contribuição de Milton Santos para a tese
Co-Authored-By: Claude Opus 5.5 <noreply@anthropic.com>
Claude-Session: https://claude.ai/code/session_01HxStpW4pQoDfJdTDYr6zEC
</commit_message>
<xml_diff>
--- a/apresentacao_qualificacao/FALAS_QUALIFICACAO.docx
+++ b/apresentacao_qualificacao/FALAS_QUALIFICACAO.docx
@@ -223,7 +223,7 @@
           <w:color w:val="666666"/>
           <w:sz w:val="19"/>
         </w:rPr>
-        <w:t xml:space="preserve">   60 s · até 02:55</w:t>
+        <w:t xml:space="preserve">   55 s · até 02:50</w:t>
       </w:r>
     </w:p>
     <w:tbl>
@@ -283,7 +283,7 @@
           <w:color w:val="666666"/>
           <w:sz w:val="19"/>
         </w:rPr>
-        <w:t xml:space="preserve">   80 s · até 04:15</w:t>
+        <w:t xml:space="preserve">   75 s · até 04:05</w:t>
       </w:r>
     </w:p>
     <w:tbl>
@@ -343,7 +343,7 @@
           <w:color w:val="666666"/>
           <w:sz w:val="19"/>
         </w:rPr>
-        <w:t xml:space="preserve">   60 s · até 05:15</w:t>
+        <w:t xml:space="preserve">   60 s · até 05:05</w:t>
       </w:r>
     </w:p>
     <w:tbl>
@@ -403,7 +403,7 @@
           <w:color w:val="666666"/>
           <w:sz w:val="19"/>
         </w:rPr>
-        <w:t xml:space="preserve">   55 s · até 06:10</w:t>
+        <w:t xml:space="preserve">   55 s · até 06:00</w:t>
       </w:r>
     </w:p>
     <w:tbl>
@@ -463,7 +463,7 @@
           <w:color w:val="666666"/>
           <w:sz w:val="19"/>
         </w:rPr>
-        <w:t xml:space="preserve">   10 s · até 06:20</w:t>
+        <w:t xml:space="preserve">   10 s · até 06:10</w:t>
       </w:r>
     </w:p>
     <w:tbl>
@@ -523,7 +523,7 @@
           <w:color w:val="666666"/>
           <w:sz w:val="19"/>
         </w:rPr>
-        <w:t xml:space="preserve">   60 s · até 07:20</w:t>
+        <w:t xml:space="preserve">   60 s · até 07:10</w:t>
       </w:r>
     </w:p>
     <w:tbl>
@@ -583,7 +583,7 @@
           <w:color w:val="666666"/>
           <w:sz w:val="19"/>
         </w:rPr>
-        <w:t xml:space="preserve">   80 s · até 08:40</w:t>
+        <w:t xml:space="preserve">   80 s · até 08:30</w:t>
       </w:r>
     </w:p>
     <w:tbl>
@@ -643,7 +643,7 @@
           <w:color w:val="666666"/>
           <w:sz w:val="19"/>
         </w:rPr>
-        <w:t xml:space="preserve">   10 s · até 08:50</w:t>
+        <w:t xml:space="preserve">   10 s · até 08:40</w:t>
       </w:r>
     </w:p>
     <w:tbl>
@@ -703,7 +703,7 @@
           <w:color w:val="666666"/>
           <w:sz w:val="19"/>
         </w:rPr>
-        <w:t xml:space="preserve">   85 s · até 10:15</w:t>
+        <w:t xml:space="preserve">   85 s · até 10:05</w:t>
       </w:r>
     </w:p>
     <w:tbl>
@@ -763,7 +763,7 @@
           <w:color w:val="666666"/>
           <w:sz w:val="19"/>
         </w:rPr>
-        <w:t xml:space="preserve">   70 s · até 11:25</w:t>
+        <w:t xml:space="preserve">   65 s · até 11:10</w:t>
       </w:r>
     </w:p>
     <w:tbl>
@@ -823,7 +823,7 @@
           <w:color w:val="666666"/>
           <w:sz w:val="19"/>
         </w:rPr>
-        <w:t xml:space="preserve">   55 s · até 12:20</w:t>
+        <w:t xml:space="preserve">   70 s · até 12:20</w:t>
       </w:r>
     </w:p>
     <w:tbl>
@@ -860,7 +860,7 @@
               <w:rPr>
                 <w:sz w:val="25"/>
               </w:rPr>
-              <w:t>Falta dizer onde a política é posta em ato. Com Milton Santos, a categoria de análise é o território usado, e as rugosidades são o que fica do passado como forma e paisagem. Com Doreen Massey, o lugar é um encontro de trajetórias, e com Castells, Pipa se liga a um espaço de fluxos que ultrapassa o lugar. Santos nomeia ainda a dissonância entre os usos econômicos e os usos sociais dos mesmos recursos: em Pipa, a densidade tecnológica do turismo convive com a escassez nas salas da escola. Massey impede que essa distância seja lida como atraso: escola e polo turístico são contemporâneos.</w:t>
+              <w:t>Falta dizer onde a política é posta em ato, e aqui Milton Santos é central. Com ele, a categoria de análise é o território usado, e o espaço é um conjunto de sistemas de objetos e de ações: os objetos condicionam as ações possíveis, e por isso laboratório, equipamentos e conexão fazem parte da política. Santos chama de rugosidades o que fica do passado como forma e paisagem, e delas vem a formulação rugosidade tecnológica. Ele nomeia ainda a dissonância entre os usos econômicos e os usos sociais dos mesmos recursos: em Pipa, a densidade tecnológica do turismo convive com a escassez nas salas da escola. Com Doreen Massey, o lugar é um encontro de trajetórias, e escola e polo turístico são contemporâneos; com Castells, Pipa se liga a um espaço de fluxos que ultrapassa o lugar.</w:t>
             </w:r>
           </w:p>
         </w:tc>

</xml_diff>

<commit_message>
Explicita na fala do slide 14 a contribuição de Doreen Massey
Co-Authored-By: Claude Opus 5.5 <noreply@anthropic.com>
Claude-Session: https://claude.ai/code/session_01HxStpW4pQoDfJdTDYr6zEC
</commit_message>
<xml_diff>
--- a/apresentacao_qualificacao/FALAS_QUALIFICACAO.docx
+++ b/apresentacao_qualificacao/FALAS_QUALIFICACAO.docx
@@ -823,7 +823,7 @@
           <w:color w:val="666666"/>
           <w:sz w:val="19"/>
         </w:rPr>
-        <w:t xml:space="preserve">   70 s · até 12:20</w:t>
+        <w:t xml:space="preserve">   80 s · até 12:30</w:t>
       </w:r>
     </w:p>
     <w:tbl>
@@ -860,7 +860,7 @@
               <w:rPr>
                 <w:sz w:val="25"/>
               </w:rPr>
-              <w:t>Falta dizer onde a política é posta em ato, e aqui Milton Santos é central. Com ele, a categoria de análise é o território usado, e o espaço é um conjunto de sistemas de objetos e de ações: os objetos condicionam as ações possíveis, e por isso laboratório, equipamentos e conexão fazem parte da política. Santos chama de rugosidades o que fica do passado como forma e paisagem, e delas vem a formulação rugosidade tecnológica. Ele nomeia ainda a dissonância entre os usos econômicos e os usos sociais dos mesmos recursos: em Pipa, a densidade tecnológica do turismo convive com a escassez nas salas da escola. Com Doreen Massey, o lugar é um encontro de trajetórias, e escola e polo turístico são contemporâneos; com Castells, Pipa se liga a um espaço de fluxos que ultrapassa o lugar.</w:t>
+              <w:t>Falta dizer onde a política é posta em ato, e aqui entram Milton Santos e Doreen Massey. Com Santos, a categoria de análise é o território usado, e o espaço é um conjunto de sistemas de objetos e de ações: laboratório, equipamentos e conexão condicionam o que a escola pode fazer. Das rugosidades, o que fica do passado como forma, vem a formulação rugosidade tecnológica; da dissonância entre os usos econômicos e os usos sociais dos mesmos recursos vem a leitura de Pipa, densa em tecnologia no turismo e escassa nas salas. Massey completa essa leitura. Para ela, o espaço é a esfera da multiplicidade, em que distintas trajetórias coexistem, e o lugar é um encontro de trajetórias: em Pipa, elas chegam à escola com as famílias de moradores antigos, de migrantes, de estrangeiros e de pessoas ligadas ao turismo. Massey critica ainda a operação que transforma a geografia em história; por isso, escola e polo turístico são contemporâneos, e a distância entre eles pede explicação, sem ser lida como atraso.</w:t>
             </w:r>
           </w:p>
         </w:tc>
@@ -883,7 +883,7 @@
           <w:color w:val="666666"/>
           <w:sz w:val="19"/>
         </w:rPr>
-        <w:t xml:space="preserve">   65 s · até 13:25</w:t>
+        <w:t xml:space="preserve">   60 s · até 13:30</w:t>
       </w:r>
     </w:p>
     <w:tbl>
@@ -943,7 +943,7 @@
           <w:color w:val="666666"/>
           <w:sz w:val="19"/>
         </w:rPr>
-        <w:t xml:space="preserve">   10 s · até 13:35</w:t>
+        <w:t xml:space="preserve">   10 s · até 13:40</w:t>
       </w:r>
     </w:p>
     <w:tbl>
@@ -1003,7 +1003,7 @@
           <w:color w:val="666666"/>
           <w:sz w:val="19"/>
         </w:rPr>
-        <w:t xml:space="preserve">   50 s · até 14:25</w:t>
+        <w:t xml:space="preserve">   50 s · até 14:30</w:t>
       </w:r>
     </w:p>
     <w:tbl>
@@ -1063,7 +1063,7 @@
           <w:color w:val="666666"/>
           <w:sz w:val="19"/>
         </w:rPr>
-        <w:t xml:space="preserve">   50 s · até 15:15</w:t>
+        <w:t xml:space="preserve">   50 s · até 15:20</w:t>
       </w:r>
     </w:p>
     <w:tbl>
@@ -1123,7 +1123,7 @@
           <w:color w:val="666666"/>
           <w:sz w:val="19"/>
         </w:rPr>
-        <w:t xml:space="preserve">   10 s · até 15:25</w:t>
+        <w:t xml:space="preserve">   10 s · até 15:30</w:t>
       </w:r>
     </w:p>
     <w:tbl>
@@ -1183,7 +1183,7 @@
           <w:color w:val="666666"/>
           <w:sz w:val="19"/>
         </w:rPr>
-        <w:t xml:space="preserve">   65 s · até 16:30</w:t>
+        <w:t xml:space="preserve">   65 s · até 16:35</w:t>
       </w:r>
     </w:p>
     <w:tbl>
@@ -1243,7 +1243,7 @@
           <w:color w:val="666666"/>
           <w:sz w:val="19"/>
         </w:rPr>
-        <w:t xml:space="preserve">   75 s · até 17:45</w:t>
+        <w:t xml:space="preserve">   70 s · até 17:45</w:t>
       </w:r>
     </w:p>
     <w:tbl>

</xml_diff>

<commit_message>
Explicita na fala do slide 15 a contribuição de Di Felice
Co-Authored-By: Claude Opus 5.5 <noreply@anthropic.com>
Claude-Session: https://claude.ai/code/session_01HxStpW4pQoDfJdTDYr6zEC
</commit_message>
<xml_diff>
--- a/apresentacao_qualificacao/FALAS_QUALIFICACAO.docx
+++ b/apresentacao_qualificacao/FALAS_QUALIFICACAO.docx
@@ -883,7 +883,7 @@
           <w:color w:val="666666"/>
           <w:sz w:val="19"/>
         </w:rPr>
-        <w:t xml:space="preserve">   60 s · até 13:30</w:t>
+        <w:t xml:space="preserve">   70 s · até 13:40</w:t>
       </w:r>
     </w:p>
     <w:tbl>
@@ -920,7 +920,7 @@
               <w:rPr>
                 <w:sz w:val="25"/>
               </w:rPr>
-              <w:t>O que atravessa a tese, e a torna necessária, é o digital. Chamo de habitar o digital as maneiras pelas quais as tecnologias digitais atravessam os espaços, as relações e as práticas cotidianas de um território, produzindo possibilidades desiguais de acesso, participação e apropriação, com Schlemmer, Backes e Palagi e com Di Felice. Essa compreensão precisa ser ensinada: Buckingham lembra que as crianças não sabem naturalmente usar computadores, Valente adverte que computadores sem preparo dos professores não trazem os benefícios esperados, e Castells, que ser excluído das redes é uma das formas mais danosas de exclusão. E o ambiente em que isso acontece tem donos e interesses: Zuboff, Silveira e Morozov tratam dos dados e das soluções prontas, e Pretto lembra que as crianças podem produzir cultura.</w:t>
+              <w:t>O que atravessa a tese, e a torna necessária, é o digital. Chamo de habitar o digital as maneiras pelas quais as tecnologias digitais atravessam os espaços, as relações e as práticas cotidianas de um território, produzindo possibilidades desiguais de acesso, participação e apropriação. A noção parte de Schlemmer, Backes e Palagi, para quem habitar é estar presente e em relação, e de Massimo Di Felice. Di Felice mostra que cada tecnologia comunicativa inaugura um novo modo de habitar, como a escrita impressa fez na Renascença, e que, com as redes digitais, o habitar se torna atópico: acontece por meio de interfaces, em ecossistemas informativos que ligam sujeito e território. Essa compreensão precisa ser ensinada: Buckingham lembra que as crianças não sabem naturalmente usar computadores, e Valente, que computadores sem preparo dos professores não trazem os benefícios esperados.</w:t>
             </w:r>
           </w:p>
         </w:tc>
@@ -943,7 +943,7 @@
           <w:color w:val="666666"/>
           <w:sz w:val="19"/>
         </w:rPr>
-        <w:t xml:space="preserve">   10 s · até 13:40</w:t>
+        <w:t xml:space="preserve">   10 s · até 13:50</w:t>
       </w:r>
     </w:p>
     <w:tbl>
@@ -1003,7 +1003,7 @@
           <w:color w:val="666666"/>
           <w:sz w:val="19"/>
         </w:rPr>
-        <w:t xml:space="preserve">   50 s · até 14:30</w:t>
+        <w:t xml:space="preserve">   50 s · até 14:40</w:t>
       </w:r>
     </w:p>
     <w:tbl>
@@ -1063,7 +1063,7 @@
           <w:color w:val="666666"/>
           <w:sz w:val="19"/>
         </w:rPr>
-        <w:t xml:space="preserve">   50 s · até 15:20</w:t>
+        <w:t xml:space="preserve">   50 s · até 15:30</w:t>
       </w:r>
     </w:p>
     <w:tbl>
@@ -1123,7 +1123,7 @@
           <w:color w:val="666666"/>
           <w:sz w:val="19"/>
         </w:rPr>
-        <w:t xml:space="preserve">   10 s · até 15:30</w:t>
+        <w:t xml:space="preserve">   10 s · até 15:40</w:t>
       </w:r>
     </w:p>
     <w:tbl>
@@ -1183,7 +1183,7 @@
           <w:color w:val="666666"/>
           <w:sz w:val="19"/>
         </w:rPr>
-        <w:t xml:space="preserve">   65 s · até 16:35</w:t>
+        <w:t xml:space="preserve">   55 s · até 16:35</w:t>
       </w:r>
     </w:p>
     <w:tbl>
@@ -1220,7 +1220,7 @@
               <w:rPr>
                 <w:sz w:val="25"/>
               </w:rPr>
-              <w:t>O capítulo começa pelas agendas da UNESCO, da OCDE e do Banco Mundial, que, com suas diferenças, deslocam o foco da presença dos recursos para as condições, os usos e as finalidades. Em seguida, compara experiências de outros territórios. O mapa reúne nove casos nas Américas, dez na Europa e o Brasil em destaque, e a cor indica a categoria principal que cada experiência informa. Nos Estados Unidos, os fossos de acesso, desenho e uso; no Uruguai, o Plan Ceibal, com acesso universal e continuidade entre governos; na Argentina, três reversões normativas em quinze anos. Na Europa, a União Europeia oferece referenciais comuns e uma estratégia de proteção infantil; a Alemanha mostra que recursos não substituem a coordenação entre escalas; e a Finlândia delega ao município a decisão sobre o uso das tecnologias, cadeia parecida com a que acompanhamos em Tibau do Sul.</w:t>
+              <w:t>O capítulo começa pelas agendas da UNESCO, da OCDE e do Banco Mundial, que, com suas diferenças, deslocam o foco da presença dos recursos para as condições, os usos e as finalidades. Em seguida, compara experiências de outros territórios. O mapa reúne nove casos nas Américas, dez na Europa e o Brasil em destaque, e a cor indica a categoria principal que cada experiência informa. Nos Estados Unidos, os fossos de acesso, desenho e uso; no Uruguai, o Plan Ceibal, com acesso universal e continuidade entre governos; na Argentina, três reversões normativas em quinze anos. Na Europa, a Finlândia delega ao município a decisão sobre o uso das tecnologias, cadeia parecida com a que acompanhamos em Tibau do Sul.</w:t>
             </w:r>
           </w:p>
         </w:tc>

</xml_diff>

<commit_message>
Explicita na fala do slide 13 a contribuição de Foucault
Co-Authored-By: Claude Opus 5.5 <noreply@anthropic.com>
Claude-Session: https://claude.ai/code/session_01HxStpW4pQoDfJdTDYr6zEC
</commit_message>
<xml_diff>
--- a/apresentacao_qualificacao/FALAS_QUALIFICACAO.docx
+++ b/apresentacao_qualificacao/FALAS_QUALIFICACAO.docx
@@ -763,7 +763,7 @@
           <w:color w:val="666666"/>
           <w:sz w:val="19"/>
         </w:rPr>
-        <w:t xml:space="preserve">   65 s · até 11:10</w:t>
+        <w:t xml:space="preserve">   75 s · até 11:20</w:t>
       </w:r>
     </w:p>
     <w:tbl>
@@ -800,7 +800,7 @@
               <w:rPr>
                 <w:sz w:val="25"/>
               </w:rPr>
-              <w:t>Dentro do contexto da prática, três noções ajudam a entender o que acontece com a política. As culturas profissionais filtram a leitura. Com Hargreaves, são crenças, valores, hábitos e formas de fazer das comunidades de professores, que podem tomar a forma do individualismo, da colaboração, da colegialidade artificial ou da balcanização. A performatividade pressiona. Ball a descreve como prestação de contas feita de julgamentos, comparações e exposições, e chama de fabricação a escola produzida para ser vista; essa pressão recai sobre um tempo de trabalho já ocupado, como mostram Queiroz e Paiva. As relações de poder tensionam. Com Foucault, o poder não é unívoco e tem focos de instabilidade; por isso as formas de atuação vão da adesão à resistência, sem que nenhuma seja pressuposta, e sem culpar nem heroicizar os sujeitos, como adverte Ball.</w:t>
+              <w:t>Dentro do contexto da prática, três noções ajudam a entender o que acontece com a política. As culturas profissionais filtram a leitura: com Hargreaves, são crenças, valores, hábitos e formas de fazer das comunidades de professores. A performatividade pressiona: Ball a descreve como prestação de contas feita de julgamentos, comparações e exposições, sobre um tempo de trabalho já ocupado, como mostram Queiroz e Paiva. As relações de poder tensionam, e aqui entra Foucault, que dá o modo de pensar a resistência do título. Com ele, Ball, Maguire e Braun tratam a política como uma economia de discursos da verdade, que organiza o que conta como verdadeiro, desejável e possível na escola. E, em Vigiar e punir, Foucault mostra que o poder não é unívoco e tem focos de instabilidade. Por isso a resistência pode aparecer sem ser pressuposta, quando os profissionais recusam, desviam, adiam ou ressignificam uma orientação, sem culpar nem heroicizar os sujeitos.</w:t>
             </w:r>
           </w:p>
         </w:tc>
@@ -823,7 +823,7 @@
           <w:color w:val="666666"/>
           <w:sz w:val="19"/>
         </w:rPr>
-        <w:t xml:space="preserve">   80 s · até 12:30</w:t>
+        <w:t xml:space="preserve">   80 s · até 12:40</w:t>
       </w:r>
     </w:p>
     <w:tbl>
@@ -883,7 +883,7 @@
           <w:color w:val="666666"/>
           <w:sz w:val="19"/>
         </w:rPr>
-        <w:t xml:space="preserve">   70 s · até 13:40</w:t>
+        <w:t xml:space="preserve">   70 s · até 13:50</w:t>
       </w:r>
     </w:p>
     <w:tbl>
@@ -943,7 +943,7 @@
           <w:color w:val="666666"/>
           <w:sz w:val="19"/>
         </w:rPr>
-        <w:t xml:space="preserve">   10 s · até 13:50</w:t>
+        <w:t xml:space="preserve">   10 s · até 14:00</w:t>
       </w:r>
     </w:p>
     <w:tbl>
@@ -1003,7 +1003,7 @@
           <w:color w:val="666666"/>
           <w:sz w:val="19"/>
         </w:rPr>
-        <w:t xml:space="preserve">   50 s · até 14:40</w:t>
+        <w:t xml:space="preserve">   50 s · até 14:50</w:t>
       </w:r>
     </w:p>
     <w:tbl>
@@ -1063,7 +1063,7 @@
           <w:color w:val="666666"/>
           <w:sz w:val="19"/>
         </w:rPr>
-        <w:t xml:space="preserve">   50 s · até 15:30</w:t>
+        <w:t xml:space="preserve">   50 s · até 15:40</w:t>
       </w:r>
     </w:p>
     <w:tbl>
@@ -1123,7 +1123,7 @@
           <w:color w:val="666666"/>
           <w:sz w:val="19"/>
         </w:rPr>
-        <w:t xml:space="preserve">   10 s · até 15:40</w:t>
+        <w:t xml:space="preserve">   10 s · até 15:50</w:t>
       </w:r>
     </w:p>
     <w:tbl>
@@ -1183,7 +1183,7 @@
           <w:color w:val="666666"/>
           <w:sz w:val="19"/>
         </w:rPr>
-        <w:t xml:space="preserve">   55 s · até 16:35</w:t>
+        <w:t xml:space="preserve">   55 s · até 16:45</w:t>
       </w:r>
     </w:p>
     <w:tbl>
@@ -1243,7 +1243,7 @@
           <w:color w:val="666666"/>
           <w:sz w:val="19"/>
         </w:rPr>
-        <w:t xml:space="preserve">   70 s · até 17:45</w:t>
+        <w:t xml:space="preserve">   60 s · até 17:45</w:t>
       </w:r>
     </w:p>
     <w:tbl>
@@ -1280,7 +1280,7 @@
               <w:rPr>
                 <w:sz w:val="25"/>
               </w:rPr>
-              <w:t>O que essa comparação traz para a tese? Das recorrências e das diferenças saem cinco categorias sensibilizadoras, que vão orientar a leitura do campo. A governança, porque coordenar escalas faz parte da política, e perguntaremos o que chega da União e do estado à rede e o que a Secretaria repassa à escola. A formação, porque a mediação dos profissionais é condição do uso, e perguntaremos que formação chegou e quando. A infraestrutura, condição relevante e insuficiente, que leva à pergunta sobre os equipamentos com que se trabalha. A continuidade institucional, que leva à história da rede municipal. E a cultura digital, ligada à cidadania e à proteção, que pergunta o que se faz com crianças de seis a dez anos. Nenhuma experiência descreve Pipa, e fica a pergunta que nenhum caso responde: o que acontece quando a PNED chega a uma escola onde parte dessas condições não está garantida?</w:t>
+              <w:t>O que essa comparação traz para a tese? Das recorrências e das diferenças saem cinco categorias sensibilizadoras para a leitura do campo: a governança, que pergunta o que chega da União e do estado à rede e o que a Secretaria repassa à escola; a formação, que pergunta que formação chegou e quando; a infraestrutura, que pergunta com que equipamentos se trabalha; a continuidade institucional, que leva à história da rede; e a cultura digital, que pergunta o que se faz com crianças de seis a dez anos. Nenhuma experiência descreve Pipa, e fica a pergunta que nenhum caso responde: o que acontece quando a PNED chega a uma escola onde parte dessas condições não está garantida?</w:t>
             </w:r>
           </w:p>
         </w:tc>

</xml_diff>